<commit_message>
Fix 4 anonymization issues: address regex, phone filter, TXT map consistency
- Fix "se sídlem" regex to work without colon in ADDRESS_RE
- Add "se sídlem" to prefix stripping list, use \s* for "bytem" prefix
- Phone numbers with +420 prefix are always phones; narrow "průkaz"
  filter to avoid catching "řidičský průkaz" as insurance card
- Fix TXT map label indexing to match JSON map (consistent numbering)

https://claude.ai/code/session_01AHreXaEBjpb7TVB5WdrzSy
</commit_message>
<xml_diff>
--- a/test_data/smlouva14_anon.docx
+++ b/test_data/smlouva14_anon.docx
@@ -209,7 +209,7 @@
     </w:p>
     <w:p>
       <w:r>
-        <w:t>Řidičský průkaz: Sk. B, C, E, č. [[ICO_1]]2, platný do [[DATE_5]]</w:t>
+        <w:t>Řidičský průkaz: Sk. B, C, E, č.[[PHONE_2]], platný do [[DATE_5]]</w:t>
       </w:r>
     </w:p>
     <w:p>
@@ -219,7 +219,7 @@
     </w:p>
     <w:p>
       <w:r>
-        <w:t>[[PHONE_2]]</w:t>
+        <w:t>[[PHONE_3]]</w:t>
       </w:r>
     </w:p>
     <w:p/>
@@ -240,7 +240,7 @@
     </w:p>
     <w:p>
       <w:r>
-        <w:t>Email: [[EMAIL_3]], [[PHONE_3]]</w:t>
+        <w:t>Email: [[EMAIL_3]], [[PHONE_4]]</w:t>
       </w:r>
     </w:p>
     <w:p/>
@@ -277,7 +277,7 @@
     </w:p>
     <w:p>
       <w:r>
-        <w:t>[[PHONE_4]]</w:t>
+        <w:t>[[PHONE_5]]</w:t>
       </w:r>
     </w:p>
     <w:p>
@@ -429,7 +429,7 @@
     </w:p>
     <w:p>
       <w:r>
-        <w:t>- Mobilní telefon: iPhone 14 Pro, [[PHONE_5]]</w:t>
+        <w:t>- Mobilní telefon: iPhone 14 Pro, [[PHONE_6]]</w:t>
       </w:r>
     </w:p>
     <w:p/>
@@ -488,7 +488,7 @@
     </w:p>
     <w:p>
       <w:r>
-        <w:t xml:space="preserve">     [[PHONE_6]]</w:t>
+        <w:t xml:space="preserve">     [[PHONE_7]]</w:t>
       </w:r>
     </w:p>
     <w:p>
@@ -509,7 +509,7 @@
     </w:p>
     <w:p>
       <w:r>
-        <w:t xml:space="preserve">     [[BIRTH_ID_7]]</w:t>
+        <w:t xml:space="preserve">     [[BIRTH_ID_1]]</w:t>
       </w:r>
     </w:p>
     <w:p/>
@@ -530,7 +530,7 @@
     </w:p>
     <w:p>
       <w:r>
-        <w:t xml:space="preserve">     - Kontaktní osoba pro zdravotní nouze: manželka ([[PHONE_7]])</w:t>
+        <w:t xml:space="preserve">     - Kontaktní osoba pro zdravotní nouze: manželka ([[PHONE_8]])</w:t>
       </w:r>
     </w:p>
     <w:p/>
@@ -652,7 +652,7 @@
     </w:p>
     <w:p>
       <w:r>
-        <w:t xml:space="preserve">     [[PHONE_8]]</w:t>
+        <w:t xml:space="preserve">     [[PHONE_9]]</w:t>
       </w:r>
     </w:p>
     <w:p>
@@ -875,17 +875,17 @@
     </w:p>
     <w:p>
       <w:r>
-        <w:t xml:space="preserve">     - Ing. [[PERSON_1]] (HR Director), [[BIRTH_ID_8]]</w:t>
-      </w:r>
-    </w:p>
-    <w:p>
-      <w:r>
-        <w:t xml:space="preserve">     - Bc. [[PERSON_11]] (HR Specialist), [[BIRTH_ID_9]]</w:t>
-      </w:r>
-    </w:p>
-    <w:p>
-      <w:r>
-        <w:t xml:space="preserve">     - Ing. [[PERSON_12]] (Payroll Manager), [[BIRTH_ID_10]]</w:t>
+        <w:t xml:space="preserve">     - Ing. [[PERSON_1]] (HR Director), [[BIRTH_ID_7]]</w:t>
+      </w:r>
+    </w:p>
+    <w:p>
+      <w:r>
+        <w:t xml:space="preserve">     - Bc. [[PERSON_11]] (HR Specialist), [[BIRTH_ID_8]]</w:t>
+      </w:r>
+    </w:p>
+    <w:p>
+      <w:r>
+        <w:t xml:space="preserve">     - Ing. [[PERSON_12]] (Payroll Manager), [[BIRTH_ID_9]]</w:t>
       </w:r>
     </w:p>
     <w:p/>
@@ -999,7 +999,7 @@
     </w:p>
     <w:p>
       <w:r>
-        <w:t>[[BIRTH_ID_8]]                            [[BIRTH_ID_1]]</w:t>
+        <w:t>[[BIRTH_ID_7]]                            [[BIRTH_ID_1]]</w:t>
       </w:r>
     </w:p>
     <w:p/>
@@ -1074,7 +1074,7 @@
     </w:p>
     <w:p>
       <w:r>
-        <w:t>[[PHONE_9]]</w:t>
+        <w:t>[[PHONE_10]]</w:t>
       </w:r>
     </w:p>
     <w:p>
@@ -1100,7 +1100,7 @@
     </w:p>
     <w:p>
       <w:r>
-        <w:t>[[BIRTH_ID_11]]</w:t>
+        <w:t>[[BIRTH_ID_10]]</w:t>
       </w:r>
     </w:p>
     <w:p>
@@ -1125,7 +1125,7 @@
     </w:p>
     <w:p>
       <w:r>
-        <w:t>[[PHONE_10]]</w:t>
+        <w:t>[[PHONE_11]]</w:t>
       </w:r>
     </w:p>
     <w:p>
@@ -1156,7 +1156,7 @@
     </w:p>
     <w:p>
       <w:r>
-        <w:t>[[DATE_18]], [[BIRTH_ID_12]]</w:t>
+        <w:t>[[DATE_18]], [[BIRTH_ID_11]]</w:t>
       </w:r>
     </w:p>
     <w:p>
@@ -1171,7 +1171,7 @@
     </w:p>
     <w:p>
       <w:r>
-        <w:t>[[PHONE_11]]</w:t>
+        <w:t>[[PHONE_12]]</w:t>
       </w:r>
     </w:p>
     <w:p/>
@@ -1182,12 +1182,12 @@
     </w:p>
     <w:p>
       <w:r>
-        <w:t>1) [[PERSON_16]], [[DATE_19]], [[BIRTH_ID_13]]</w:t>
-      </w:r>
-    </w:p>
-    <w:p>
-      <w:r>
-        <w:t>2) [[PERSON_17]], [[DATE_20]], [[BIRTH_ID_14]]</w:t>
+        <w:t>1) [[PERSON_16]], [[DATE_19]], [[BIRTH_ID_12]]</w:t>
+      </w:r>
+    </w:p>
+    <w:p>
+      <w:r>
+        <w:t>2) [[PERSON_17]], [[DATE_20]], [[BIRTH_ID_13]]</w:t>
       </w:r>
     </w:p>
     <w:p/>
@@ -1442,7 +1442,7 @@
     </w:p>
     <w:p>
       <w:r>
-        <w:t xml:space="preserve">                 [[PHONE_12]]</w:t>
+        <w:t xml:space="preserve">                 [[PHONE_13]]</w:t>
       </w:r>
     </w:p>
     <w:p/>
@@ -1468,7 +1468,7 @@
     </w:p>
     <w:p>
       <w:r>
-        <w:t xml:space="preserve">      [[PHONE_13]]</w:t>
+        <w:t xml:space="preserve">      [[PHONE_14]]</w:t>
       </w:r>
     </w:p>
     <w:p>
@@ -1705,7 +1705,7 @@
     </w:p>
     <w:p>
       <w:r>
-        <w:t xml:space="preserve">     [[BIRTH_ID_12]]</w:t>
+        <w:t xml:space="preserve">     [[BIRTH_ID_11]]</w:t>
       </w:r>
     </w:p>
     <w:p>
@@ -1730,12 +1730,12 @@
     </w:p>
     <w:p>
       <w:r>
-        <w:t xml:space="preserve">     50%: [[PERSON_16]] (syn), [[BIRTH_ID_13]]</w:t>
-      </w:r>
-    </w:p>
-    <w:p>
-      <w:r>
-        <w:t xml:space="preserve">     50%: [[PERSON_17]] (dcera), [[BIRTH_ID_14]]</w:t>
+        <w:t xml:space="preserve">     50%: [[PERSON_16]] (syn), [[BIRTH_ID_12]]</w:t>
+      </w:r>
+    </w:p>
+    <w:p>
+      <w:r>
+        <w:t xml:space="preserve">     50%: [[PERSON_17]] (dcera), [[BIRTH_ID_13]]</w:t>
       </w:r>
     </w:p>
     <w:p>
@@ -1755,7 +1755,7 @@
     </w:p>
     <w:p>
       <w:r>
-        <w:t xml:space="preserve">     [[BIRTH_ID_15]]</w:t>
+        <w:t xml:space="preserve">     [[BIRTH_ID_14]]</w:t>
       </w:r>
     </w:p>
     <w:p>
@@ -1765,7 +1765,7 @@
     </w:p>
     <w:p>
       <w:r>
-        <w:t xml:space="preserve">     [[PHONE_14]]</w:t>
+        <w:t xml:space="preserve">     [[PHONE_15]]</w:t>
       </w:r>
     </w:p>
     <w:p/>
@@ -1819,7 +1819,7 @@
     </w:p>
     <w:p>
       <w:r>
-        <w:t xml:space="preserve">     Majitel: MUDr. [[PERSON_14]], [[BIRTH_ID_11]]</w:t>
+        <w:t xml:space="preserve">     Majitel: MUDr. [[PERSON_14]], [[BIRTH_ID_10]]</w:t>
       </w:r>
     </w:p>
     <w:p/>
@@ -2006,12 +2006,12 @@
     </w:p>
     <w:p>
       <w:r>
-        <w:t xml:space="preserve">       [[BIRTH_ID_16]], č. lékaře: 34567</w:t>
-      </w:r>
-    </w:p>
-    <w:p>
-      <w:r>
-        <w:t xml:space="preserve">       [[ADDRESS_12]], [[PHONE_15]]</w:t>
+        <w:t xml:space="preserve">       [[BIRTH_ID_15]], č. lékaře: 34567</w:t>
+      </w:r>
+    </w:p>
+    <w:p>
+      <w:r>
+        <w:t xml:space="preserve">       [[ADDRESS_12]], [[PHONE_16]]</w:t>
       </w:r>
     </w:p>
     <w:p>
@@ -2026,12 +2026,12 @@
     </w:p>
     <w:p>
       <w:r>
-        <w:t xml:space="preserve">       [[BIRTH_ID_17]], č. lékaře: 45678</w:t>
-      </w:r>
-    </w:p>
-    <w:p>
-      <w:r>
-        <w:t xml:space="preserve">       [[ADDRESS_15]], [[PHONE_16]]</w:t>
+        <w:t xml:space="preserve">       [[BIRTH_ID_16]], č. lékaře: 45678</w:t>
+      </w:r>
+    </w:p>
+    <w:p>
+      <w:r>
+        <w:t xml:space="preserve">       [[ADDRESS_15]], [[PHONE_17]]</w:t>
       </w:r>
     </w:p>
     <w:p>
@@ -2046,12 +2046,12 @@
     </w:p>
     <w:p>
       <w:r>
-        <w:t xml:space="preserve">       [[BIRTH_ID_18]], č. lékaře: 56789</w:t>
-      </w:r>
-    </w:p>
-    <w:p>
-      <w:r>
-        <w:t xml:space="preserve">       [[ADDRESS_11]], [[PHONE_17]]</w:t>
+        <w:t xml:space="preserve">       [[BIRTH_ID_17]], č. lékaře: 56789</w:t>
+      </w:r>
+    </w:p>
+    <w:p>
+      <w:r>
+        <w:t xml:space="preserve">       [[ADDRESS_11]], [[PHONE_18]]</w:t>
       </w:r>
     </w:p>
     <w:p>
@@ -2071,7 +2071,7 @@
     </w:p>
     <w:p>
       <w:r>
-        <w:t xml:space="preserve">       Kontakt: Lékařská služba, [[PHONE_18]]</w:t>
+        <w:t xml:space="preserve">       Kontakt: Lékařská služba, [[PHONE_19]]</w:t>
       </w:r>
     </w:p>
     <w:p/>
@@ -2108,7 +2108,7 @@
     </w:p>
     <w:p>
       <w:r>
-        <w:t xml:space="preserve">     [[BIRTH_ID_19]]</w:t>
+        <w:t xml:space="preserve">     [[BIRTH_ID_18]]</w:t>
       </w:r>
     </w:p>
     <w:p>
@@ -2272,7 +2272,7 @@
     </w:p>
     <w:p>
       <w:r>
-        <w:t>Premium Life pojišťovna a.s.               [[BIRTH_ID_11]]</w:t>
+        <w:t>Premium Life pojišťovna a.s.               [[BIRTH_ID_10]]</w:t>
       </w:r>
     </w:p>
     <w:p/>
@@ -2352,73 +2352,73 @@
     </w:p>
     <w:p>
       <w:r>
+        <w:t>[[BIRTH_ID_19]]</w:t>
+      </w:r>
+    </w:p>
+    <w:p>
+      <w:r>
+        <w:t>Email: [[EMAIL_11]]</w:t>
+      </w:r>
+    </w:p>
+    <w:p>
+      <w:r>
+        <w:t>[[PHONE_20]]</w:t>
+      </w:r>
+    </w:p>
+    <w:p>
+      <w:r>
+        <w:t>Licence ČNB: ZZS-0456/2020</w:t>
+      </w:r>
+    </w:p>
+    <w:p/>
+    <w:p>
+      <w:r>
+        <w:t>ZPRACOVATEL (PROCESSOR):</w:t>
+      </w:r>
+    </w:p>
+    <w:p>
+      <w:r>
+        <w:t>CloudMed Services a.s.</w:t>
+      </w:r>
+    </w:p>
+    <w:p>
+      <w:r>
+        <w:t>[[ICO_6]]</w:t>
+      </w:r>
+    </w:p>
+    <w:p>
+      <w:r>
+        <w:t>DIČ: [[DIC_2]]</w:t>
+      </w:r>
+    </w:p>
+    <w:p>
+      <w:r>
+        <w:t>[[ADDRESS_18]]</w:t>
+      </w:r>
+    </w:p>
+    <w:p>
+      <w:r>
+        <w:t>Zastoupen: Ing. [[PERSON_11]], Ph.D., generální ředitelka</w:t>
+      </w:r>
+    </w:p>
+    <w:p>
+      <w:r>
+        <w:t>[[DATE_35]]</w:t>
+      </w:r>
+    </w:p>
+    <w:p>
+      <w:r>
         <w:t>[[BIRTH_ID_20]]</w:t>
       </w:r>
     </w:p>
     <w:p>
       <w:r>
-        <w:t>Email: [[EMAIL_11]]</w:t>
-      </w:r>
-    </w:p>
-    <w:p>
-      <w:r>
-        <w:t>[[PHONE_19]]</w:t>
-      </w:r>
-    </w:p>
-    <w:p>
-      <w:r>
-        <w:t>Licence ČNB: ZZS-0456/2020</w:t>
-      </w:r>
-    </w:p>
-    <w:p/>
-    <w:p>
-      <w:r>
-        <w:t>ZPRACOVATEL (PROCESSOR):</w:t>
-      </w:r>
-    </w:p>
-    <w:p>
-      <w:r>
-        <w:t>CloudMed Services a.s.</w:t>
-      </w:r>
-    </w:p>
-    <w:p>
-      <w:r>
-        <w:t>[[ICO_6]]</w:t>
-      </w:r>
-    </w:p>
-    <w:p>
-      <w:r>
-        <w:t>DIČ: [[DIC_2]]</w:t>
-      </w:r>
-    </w:p>
-    <w:p>
-      <w:r>
-        <w:t>[[ADDRESS_18]]</w:t>
-      </w:r>
-    </w:p>
-    <w:p>
-      <w:r>
-        <w:t>Zastoupen: Ing. [[PERSON_11]], Ph.D., generální ředitelka</w:t>
-      </w:r>
-    </w:p>
-    <w:p>
-      <w:r>
-        <w:t>[[DATE_35]]</w:t>
-      </w:r>
-    </w:p>
-    <w:p>
-      <w:r>
-        <w:t>[[BIRTH_ID_21]]</w:t>
-      </w:r>
-    </w:p>
-    <w:p>
-      <w:r>
         <w:t>Email: [[EMAIL_12]]</w:t>
       </w:r>
     </w:p>
     <w:p>
       <w:r>
-        <w:t>[[PHONE_20]]</w:t>
+        <w:t>[[PHONE_21]]</w:t>
       </w:r>
     </w:p>
     <w:p>
@@ -2526,7 +2526,7 @@
     </w:p>
     <w:p>
       <w:r>
-        <w:t xml:space="preserve">     [[BIRTH_ID_22]]</w:t>
+        <w:t xml:space="preserve">     [[BIRTH_ID_21]]</w:t>
       </w:r>
     </w:p>
     <w:p>
@@ -2541,7 +2541,7 @@
     </w:p>
     <w:p>
       <w:r>
-        <w:t xml:space="preserve">     [[PHONE_21]]</w:t>
+        <w:t xml:space="preserve">     [[PHONE_22]]</w:t>
       </w:r>
     </w:p>
     <w:p>
@@ -2551,7 +2551,7 @@
     </w:p>
     <w:p>
       <w:r>
-        <w:t xml:space="preserve">     Pojišťovna: VZP, [[BIRTH_ID_23]]</w:t>
+        <w:t xml:space="preserve">     Pojišťovna: VZP, [[BIRTH_ID_21]]</w:t>
       </w:r>
     </w:p>
     <w:p>
@@ -2592,12 +2592,12 @@
     </w:p>
     <w:p>
       <w:r>
-        <w:t xml:space="preserve">     - MUDr. [[PERSON_19]] (internista), [[BIRTH_ID_24]], č. lékaře: 23456</w:t>
-      </w:r>
-    </w:p>
-    <w:p>
-      <w:r>
-        <w:t xml:space="preserve">     - MUDr. [[PERSON_8]] (diabetolog), [[BIRTH_ID_25]], č. lékaře: 34567</w:t>
+        <w:t xml:space="preserve">     - MUDr. [[PERSON_19]] (internista), [[BIRTH_ID_22]], č. lékaře: 23456</w:t>
+      </w:r>
+    </w:p>
+    <w:p>
+      <w:r>
+        <w:t xml:space="preserve">     - MUDr. [[PERSON_8]] (diabetolog), [[BIRTH_ID_23]], č. lékaře: 34567</w:t>
       </w:r>
     </w:p>
     <w:p>
@@ -2682,7 +2682,7 @@
     </w:p>
     <w:p>
       <w:r>
-        <w:t xml:space="preserve">     [[BIRTH_ID_26]]</w:t>
+        <w:t xml:space="preserve">     [[BIRTH_ID_24]]</w:t>
       </w:r>
     </w:p>
     <w:p>
@@ -2697,7 +2697,7 @@
     </w:p>
     <w:p>
       <w:r>
-        <w:t xml:space="preserve">     [[PHONE_22]]</w:t>
+        <w:t xml:space="preserve">     [[PHONE_23]]</w:t>
       </w:r>
     </w:p>
     <w:p>
@@ -2707,7 +2707,7 @@
     </w:p>
     <w:p>
       <w:r>
-        <w:t xml:space="preserve">     Pojišťovna: ČPZP, [[BIRTH_ID_27]]</w:t>
+        <w:t xml:space="preserve">     Pojišťovna: ČPZP, [[BIRTH_ID_24]]</w:t>
       </w:r>
     </w:p>
     <w:p>
@@ -2748,7 +2748,7 @@
     </w:p>
     <w:p>
       <w:r>
-        <w:t xml:space="preserve">     [[BIRTH_ID_28]], č. lékaře: 45678</w:t>
+        <w:t xml:space="preserve">     [[BIRTH_ID_25]], č. lékaře: 45678</w:t>
       </w:r>
     </w:p>
     <w:p>
@@ -2803,7 +2803,7 @@
     </w:p>
     <w:p>
       <w:r>
-        <w:t xml:space="preserve">     [[BIRTH_ID_29]], registr. č.: 34567</w:t>
+        <w:t xml:space="preserve">     [[BIRTH_ID_26]], registr. č.: 34567</w:t>
       </w:r>
     </w:p>
     <w:p>
@@ -2863,7 +2863,7 @@
     </w:p>
     <w:p>
       <w:r>
-        <w:t xml:space="preserve">     [[BIRTH_ID_30]]</w:t>
+        <w:t xml:space="preserve">     [[BIRTH_ID_27]]</w:t>
       </w:r>
     </w:p>
     <w:p>
@@ -2878,7 +2878,7 @@
     </w:p>
     <w:p>
       <w:r>
-        <w:t xml:space="preserve">     [[PHONE_23]]</w:t>
+        <w:t xml:space="preserve">     [[PHONE_24]]</w:t>
       </w:r>
     </w:p>
     <w:p>
@@ -2888,7 +2888,7 @@
     </w:p>
     <w:p>
       <w:r>
-        <w:t xml:space="preserve">     Pojišťovna: VoZP, [[BIRTH_ID_31]]</w:t>
+        <w:t xml:space="preserve">     Pojišťovna: VoZP, [[BIRTH_ID_27]]</w:t>
       </w:r>
     </w:p>
     <w:p>
@@ -2928,7 +2928,7 @@
     </w:p>
     <w:p>
       <w:r>
-        <w:t xml:space="preserve">     [[BIRTH_ID_32]], č. lékaře: 56789</w:t>
+        <w:t xml:space="preserve">     [[BIRTH_ID_28]], č. lékaře: 56789</w:t>
       </w:r>
     </w:p>
     <w:p>
@@ -3043,12 +3043,12 @@
     </w:p>
     <w:p>
       <w:r>
-        <w:t xml:space="preserve">     1) [[PERSON_15]], [[BIRTH_ID_33]]</w:t>
-      </w:r>
-    </w:p>
-    <w:p>
-      <w:r>
-        <w:t xml:space="preserve">     2) [[PERSON_29]], [[BIRTH_ID_34]]</w:t>
+        <w:t xml:space="preserve">     1) [[PERSON_15]], [[BIRTH_ID_29]]</w:t>
+      </w:r>
+    </w:p>
+    <w:p>
+      <w:r>
+        <w:t xml:space="preserve">     2) [[PERSON_29]], [[BIRTH_ID_30]]</w:t>
       </w:r>
     </w:p>
     <w:p/>
@@ -3079,7 +3079,7 @@
     </w:p>
     <w:p>
       <w:r>
-        <w:t xml:space="preserve">        [[BIRTH_ID_20]]</w:t>
+        <w:t xml:space="preserve">        [[BIRTH_ID_19]]</w:t>
       </w:r>
     </w:p>
     <w:p>
@@ -3109,27 +3109,574 @@
     </w:p>
     <w:p>
       <w:r>
+        <w:t xml:space="preserve">        [[BIRTH_ID_31]]</w:t>
+      </w:r>
+    </w:p>
+    <w:p>
+      <w:r>
+        <w:t xml:space="preserve">        [[USERNAME_5]]</w:t>
+      </w:r>
+    </w:p>
+    <w:p>
+      <w:r>
+        <w:t xml:space="preserve">        Role: Physician, Read/Write</w:t>
+      </w:r>
+    </w:p>
+    <w:p>
+      <w:r>
+        <w:t xml:space="preserve">     </w:t>
+      </w:r>
+    </w:p>
+    <w:p>
+      <w:r>
+        <w:t xml:space="preserve">     3) Bc. [[PERSON_11]] (zdravotní sestra)</w:t>
+      </w:r>
+    </w:p>
+    <w:p>
+      <w:r>
+        <w:t xml:space="preserve">        [[BIRTH_ID_32]]</w:t>
+      </w:r>
+    </w:p>
+    <w:p>
+      <w:r>
+        <w:t xml:space="preserve">        [[USERNAME_6]]</w:t>
+      </w:r>
+    </w:p>
+    <w:p>
+      <w:r>
+        <w:t xml:space="preserve">        Role: Nurse, Limited access</w:t>
+      </w:r>
+    </w:p>
+    <w:p>
+      <w:r>
+        <w:t xml:space="preserve">     </w:t>
+      </w:r>
+    </w:p>
+    <w:p>
+      <w:r>
+        <w:t xml:space="preserve">     4) Ing. [[PERSON_30]] (IT administrátor)</w:t>
+      </w:r>
+    </w:p>
+    <w:p>
+      <w:r>
+        <w:t xml:space="preserve">        [[BIRTH_ID_33]]</w:t>
+      </w:r>
+    </w:p>
+    <w:p>
+      <w:r>
+        <w:t xml:space="preserve">        [[USERNAME_7]]</w:t>
+      </w:r>
+    </w:p>
+    <w:p>
+      <w:r>
+        <w:t xml:space="preserve">        Role: Technical admin</w:t>
+      </w:r>
+    </w:p>
+    <w:p>
+      <w:r>
+        <w:t xml:space="preserve">        Certifikace: RHCE, CCNA, ISO 27001 Lead Implementer</w:t>
+      </w:r>
+    </w:p>
+    <w:p>
+      <w:r>
+        <w:t xml:space="preserve">     </w:t>
+      </w:r>
+    </w:p>
+    <w:p>
+      <w:r>
+        <w:t xml:space="preserve">     5) Bc. [[PERSON_8]] (účetní)</w:t>
+      </w:r>
+    </w:p>
+    <w:p>
+      <w:r>
+        <w:t xml:space="preserve">        [[BIRTH_ID_34]]</w:t>
+      </w:r>
+    </w:p>
+    <w:p>
+      <w:r>
+        <w:t xml:space="preserve">        [[USERNAME_8]]</w:t>
+      </w:r>
+    </w:p>
+    <w:p>
+      <w:r>
+        <w:t xml:space="preserve">        Role: Billing, Read-only patient data</w:t>
+      </w:r>
+    </w:p>
+    <w:p/>
+    <w:p>
+      <w:r>
+        <w:t>───────────────────────────────────────────────────────────────────────────────</w:t>
+      </w:r>
+    </w:p>
+    <w:p/>
+    <w:p>
+      <w:r>
+        <w:t>ČLÁNEK III. - KATEGORIE OSOBNÍCH ÚDAJŮ</w:t>
+      </w:r>
+    </w:p>
+    <w:p/>
+    <w:p>
+      <w:r>
+        <w:t>3.1. ZÁKLADNÍ IDENTIFIKAČNÍ ÚDAJE:</w:t>
+      </w:r>
+    </w:p>
+    <w:p>
+      <w:r>
+        <w:t xml:space="preserve">     - Jméno, příjmení, tituly</w:t>
+      </w:r>
+    </w:p>
+    <w:p>
+      <w:r>
+        <w:t xml:space="preserve">     - Rodné číslo</w:t>
+      </w:r>
+    </w:p>
+    <w:p>
+      <w:r>
+        <w:t xml:space="preserve">     - Datum a místo narození</w:t>
+      </w:r>
+    </w:p>
+    <w:p>
+      <w:r>
+        <w:t xml:space="preserve">     - Adresa trvalého pobytu</w:t>
+      </w:r>
+    </w:p>
+    <w:p>
+      <w:r>
+        <w:t xml:space="preserve">     - Kontaktní údaje (telefon, email)</w:t>
+      </w:r>
+    </w:p>
+    <w:p/>
+    <w:p>
+      <w:r>
+        <w:t>3.2. ZVLÁŠTNÍ KATEGORIE OSOBNÍCH ÚDAJŮ (čl. 9 GDPR):</w:t>
+      </w:r>
+    </w:p>
+    <w:p>
+      <w:r>
+        <w:t xml:space="preserve">     </w:t>
+      </w:r>
+    </w:p>
+    <w:p>
+      <w:r>
+        <w:t xml:space="preserve">     A) ZDRAVOTNÍ ÚDAJE:</w:t>
+      </w:r>
+    </w:p>
+    <w:p>
+      <w:r>
+        <w:t xml:space="preserve">        - Diagnózy (ICD-10 kódy)</w:t>
+      </w:r>
+    </w:p>
+    <w:p>
+      <w:r>
+        <w:t xml:space="preserve">        - Anamnézy (osobní, rodinná)</w:t>
+      </w:r>
+    </w:p>
+    <w:p>
+      <w:r>
+        <w:t xml:space="preserve">        - Medikace (název, dávka, frekvence)</w:t>
+      </w:r>
+    </w:p>
+    <w:p>
+      <w:r>
+        <w:t xml:space="preserve">        - Laboratorní výsledky</w:t>
+      </w:r>
+    </w:p>
+    <w:p>
+      <w:r>
+        <w:t xml:space="preserve">        - Obrazová dokumentace (RTG, CT, MRI, ultrazvuk)</w:t>
+      </w:r>
+    </w:p>
+    <w:p>
+      <w:r>
+        <w:t xml:space="preserve">        - Operační protokoly</w:t>
+      </w:r>
+    </w:p>
+    <w:p>
+      <w:r>
+        <w:t xml:space="preserve">        - Propouštěcí zprávy</w:t>
+      </w:r>
+    </w:p>
+    <w:p>
+      <w:r>
+        <w:t xml:space="preserve">        - Lékařské zprávy</w:t>
+      </w:r>
+    </w:p>
+    <w:p>
+      <w:r>
+        <w:t xml:space="preserve">        - Vakcinační průkaz</w:t>
+      </w:r>
+    </w:p>
+    <w:p>
+      <w:r>
+        <w:t xml:space="preserve">     </w:t>
+      </w:r>
+    </w:p>
+    <w:p>
+      <w:r>
+        <w:t xml:space="preserve">     B) GENETICKÉ ÚDAJE:</w:t>
+      </w:r>
+    </w:p>
+    <w:p>
+      <w:r>
+        <w:t xml:space="preserve">        - Genetické testy (BRCA1/BRCA2, atd.)</w:t>
+      </w:r>
+    </w:p>
+    <w:p>
+      <w:r>
+        <w:t xml:space="preserve">        - Predispozice k nemocem</w:t>
+      </w:r>
+    </w:p>
+    <w:p>
+      <w:r>
+        <w:t xml:space="preserve">        - Farmakogenetické profily</w:t>
+      </w:r>
+    </w:p>
+    <w:p>
+      <w:r>
+        <w:lastRenderedPageBreak/>
+        <w:t xml:space="preserve">     </w:t>
+      </w:r>
+    </w:p>
+    <w:p>
+      <w:r>
+        <w:t xml:space="preserve">     C) BIOMETRICKÉ ÚDAJE:</w:t>
+      </w:r>
+    </w:p>
+    <w:p>
+      <w:r>
+        <w:t xml:space="preserve">        - Fotografie pacienta (pro identifikaci)</w:t>
+      </w:r>
+    </w:p>
+    <w:p>
+      <w:r>
+        <w:t xml:space="preserve">        - Digitalizované podpisy</w:t>
+      </w:r>
+    </w:p>
+    <w:p>
+      <w:r>
+        <w:t xml:space="preserve">        - Otisk prstu (pro přístup k terminálům)</w:t>
+      </w:r>
+    </w:p>
+    <w:p/>
+    <w:p>
+      <w:r>
+        <w:t>3.3. FINANČNÍ ÚDAJE:</w:t>
+      </w:r>
+    </w:p>
+    <w:p>
+      <w:r>
+        <w:t xml:space="preserve">     - Čísla pojištěnců</w:t>
+      </w:r>
+    </w:p>
+    <w:p>
+      <w:r>
+        <w:t xml:space="preserve">     - Fakturační údaje</w:t>
+      </w:r>
+    </w:p>
+    <w:p>
+      <w:r>
+        <w:t xml:space="preserve">     - Bankovní účty pro vrácení doplatků</w:t>
+      </w:r>
+    </w:p>
+    <w:p>
+      <w:r>
+        <w:t xml:space="preserve">     - Doklady o úhradách</w:t>
+      </w:r>
+    </w:p>
+    <w:p/>
+    <w:p>
+      <w:r>
+        <w:t>3.4. KOMUNIKAČNÍ METADATA:</w:t>
+      </w:r>
+    </w:p>
+    <w:p>
+      <w:r>
+        <w:t xml:space="preserve">     - IP adresy přístupů</w:t>
+      </w:r>
+    </w:p>
+    <w:p>
+      <w:r>
+        <w:t xml:space="preserve">     - Logy přihlášení</w:t>
+      </w:r>
+    </w:p>
+    <w:p>
+      <w:r>
+        <w:t xml:space="preserve">     - Historie změn v záznamech</w:t>
+      </w:r>
+    </w:p>
+    <w:p>
+      <w:r>
+        <w:t xml:space="preserve">     - Email komunikace s pacienty</w:t>
+      </w:r>
+    </w:p>
+    <w:p/>
+    <w:p>
+      <w:r>
+        <w:t>───────────────────────────────────────────────────────────────────────────────</w:t>
+      </w:r>
+    </w:p>
+    <w:p/>
+    <w:p>
+      <w:r>
+        <w:t>ČLÁNEK IV. - TECHNICKÉ A ORGANIZAČNÍ OPATŘENÍ</w:t>
+      </w:r>
+    </w:p>
+    <w:p/>
+    <w:p>
+      <w:r>
+        <w:t>4.1. INFRASTRUKTURA:</w:t>
+      </w:r>
+    </w:p>
+    <w:p>
+      <w:r>
+        <w:t xml:space="preserve">     </w:t>
+      </w:r>
+    </w:p>
+    <w:p>
+      <w:r>
+        <w:t xml:space="preserve">     Primární datacenter:</w:t>
+      </w:r>
+    </w:p>
+    <w:p>
+      <w:r>
+        <w:t xml:space="preserve">     Lokace: Datová hala Praha - Holešovice</w:t>
+      </w:r>
+    </w:p>
+    <w:p>
+      <w:r>
+        <w:t xml:space="preserve">     [[ADDRESS_23]]</w:t>
+      </w:r>
+    </w:p>
+    <w:p>
+      <w:r>
+        <w:t xml:space="preserve">     Rack: R-24-A-03</w:t>
+      </w:r>
+    </w:p>
+    <w:p>
+      <w:r>
+        <w:t xml:space="preserve">     Servery:</w:t>
+      </w:r>
+    </w:p>
+    <w:p>
+      <w:r>
+        <w:t xml:space="preserve">     - DB-PROD-01: [[IP_2]] (primary database)</w:t>
+      </w:r>
+    </w:p>
+    <w:p>
+      <w:r>
+        <w:t xml:space="preserve">     - DB-PROD-02: [[IP_3]] (replica)</w:t>
+      </w:r>
+    </w:p>
+    <w:p>
+      <w:r>
+        <w:t xml:space="preserve">     - APP-PROD-01: [[IP_4]] (application server)</w:t>
+      </w:r>
+    </w:p>
+    <w:p>
+      <w:r>
+        <w:t xml:space="preserve">     - APP-PROD-02: [[IP_5]] (load balancer)</w:t>
+      </w:r>
+    </w:p>
+    <w:p>
+      <w:r>
+        <w:t xml:space="preserve">     </w:t>
+      </w:r>
+    </w:p>
+    <w:p>
+      <w:r>
+        <w:t xml:space="preserve">     Backup datacenter:</w:t>
+      </w:r>
+    </w:p>
+    <w:p>
+      <w:r>
+        <w:t xml:space="preserve">     Lokace: DataCloud Brno</w:t>
+      </w:r>
+    </w:p>
+    <w:p>
+      <w:r>
+        <w:t xml:space="preserve">     [[ADDRESS_24]]</w:t>
+      </w:r>
+    </w:p>
+    <w:p>
+      <w:r>
+        <w:t xml:space="preserve">     Rack: R-18-B-07</w:t>
+      </w:r>
+    </w:p>
+    <w:p>
+      <w:r>
+        <w:t xml:space="preserve">     Replikace: real-time (&lt; 5 min RPO)</w:t>
+      </w:r>
+    </w:p>
+    <w:p>
+      <w:r>
+        <w:t xml:space="preserve">     </w:t>
+      </w:r>
+    </w:p>
+    <w:p>
+      <w:r>
+        <w:t xml:space="preserve">     Cloud backup:</w:t>
+      </w:r>
+    </w:p>
+    <w:p>
+      <w:r>
+        <w:t xml:space="preserve">     Provider: AWS Frankfurt (eu-central-1)</w:t>
+      </w:r>
+    </w:p>
+    <w:p>
+      <w:r>
+        <w:t xml:space="preserve">     Šifrování: AES-256</w:t>
+      </w:r>
+    </w:p>
+    <w:p>
+      <w:r>
+        <w:t xml:space="preserve">     Retence: 7 let (dle zákona 372/2011 Sb.)</w:t>
+      </w:r>
+    </w:p>
+    <w:p/>
+    <w:p>
+      <w:r>
+        <w:t>4.2. PŘÍSTUPOVÉ ÚDAJE (SPRÁVCE):</w:t>
+      </w:r>
+    </w:p>
+    <w:p>
+      <w:r>
+        <w:t xml:space="preserve">     </w:t>
+      </w:r>
+    </w:p>
+    <w:p>
+      <w:r>
+        <w:t xml:space="preserve">     Database access:</w:t>
+      </w:r>
+    </w:p>
+    <w:p>
+      <w:r>
+        <w:t xml:space="preserve">     [[HOST_1]]</w:t>
+      </w:r>
+    </w:p>
+    <w:p>
+      <w:r>
+        <w:t xml:space="preserve">     Port: 5432 (PostgreSQL)</w:t>
+      </w:r>
+    </w:p>
+    <w:p>
+      <w:r>
+        <w:t xml:space="preserve">     Database: healthcarepro_production</w:t>
+      </w:r>
+    </w:p>
+    <w:p>
+      <w:r>
+        <w:t xml:space="preserve">     [[USERNAME_9]]</w:t>
+      </w:r>
+    </w:p>
+    <w:p>
+      <w:r>
+        <w:t xml:space="preserve">     [[PASSWORD_2]]</w:t>
+      </w:r>
+    </w:p>
+    <w:p>
+      <w:r>
+        <w:t xml:space="preserve">     SSL: required (cert: hcp-2024.pem)</w:t>
+      </w:r>
+    </w:p>
+    <w:p>
+      <w:r>
+        <w:t xml:space="preserve">     </w:t>
+      </w:r>
+    </w:p>
+    <w:p>
+      <w:r>
+        <w:t xml:space="preserve">     Application admin panel:</w:t>
+      </w:r>
+    </w:p>
+    <w:p>
+      <w:r>
+        <w:t xml:space="preserve">     URL: https://admin.healthcarepro.cloudmed.cz</w:t>
+      </w:r>
+    </w:p>
+    <w:p>
+      <w:r>
+        <w:t xml:space="preserve">     [[USERNAME_10]]</w:t>
+      </w:r>
+    </w:p>
+    <w:p>
+      <w:r>
+        <w:t xml:space="preserve">     [[PASSWORD_3]]</w:t>
+      </w:r>
+    </w:p>
+    <w:p>
+      <w:r>
+        <w:t xml:space="preserve">     2FA: TOTP (Google Authenticator)</w:t>
+      </w:r>
+    </w:p>
+    <w:p>
+      <w:r>
+        <w:t xml:space="preserve">     </w:t>
+      </w:r>
+    </w:p>
+    <w:p>
+      <w:r>
+        <w:t xml:space="preserve">     SFTP backup access:</w:t>
+      </w:r>
+    </w:p>
+    <w:p>
+      <w:r>
+        <w:t xml:space="preserve">     [[HOST_2]]</w:t>
+      </w:r>
+    </w:p>
+    <w:p>
+      <w:r>
+        <w:t xml:space="preserve">     Port: 22</w:t>
+      </w:r>
+    </w:p>
+    <w:p>
+      <w:r>
+        <w:t xml:space="preserve">     [[USERNAME_11]]</w:t>
+      </w:r>
+    </w:p>
+    <w:p>
+      <w:r>
+        <w:t xml:space="preserve">     SSH Key: hcp-backup-2024.key (4096-bit RSA)</w:t>
+      </w:r>
+    </w:p>
+    <w:p/>
+    <w:p>
+      <w:r>
+        <w:t>4.3. OPRÁVNĚNÉ OSOBY ZPRACOVATELE:</w:t>
+      </w:r>
+    </w:p>
+    <w:p>
+      <w:r>
+        <w:t xml:space="preserve">     </w:t>
+      </w:r>
+    </w:p>
+    <w:p>
+      <w:r>
+        <w:t xml:space="preserve">     1) Ing. [[PERSON_31]] (Cloud Architect)</w:t>
+      </w:r>
+    </w:p>
+    <w:p>
+      <w:r>
         <w:t xml:space="preserve">        [[BIRTH_ID_35]]</w:t>
       </w:r>
     </w:p>
     <w:p>
       <w:r>
-        <w:t xml:space="preserve">        [[USERNAME_5]]</w:t>
-      </w:r>
-    </w:p>
-    <w:p>
-      <w:r>
-        <w:t xml:space="preserve">        Role: Physician, Read/Write</w:t>
-      </w:r>
-    </w:p>
-    <w:p>
-      <w:r>
-        <w:t xml:space="preserve">     </w:t>
-      </w:r>
-    </w:p>
-    <w:p>
-      <w:r>
-        <w:t xml:space="preserve">     3) Bc. [[PERSON_11]] (zdravotní sestra)</w:t>
+        <w:t xml:space="preserve">        Email: [[EMAIL_16]]</w:t>
+      </w:r>
+    </w:p>
+    <w:p>
+      <w:r>
+        <w:t xml:space="preserve">        Certifikace: AWS Solutions Architect Professional</w:t>
+      </w:r>
+    </w:p>
+    <w:p>
+      <w:r>
+        <w:t xml:space="preserve">     </w:t>
+      </w:r>
+    </w:p>
+    <w:p>
+      <w:r>
+        <w:t xml:space="preserve">     2) Bc. [[PERSON_32]] (DBA)</w:t>
       </w:r>
     </w:p>
     <w:p>
@@ -3139,22 +3686,22 @@
     </w:p>
     <w:p>
       <w:r>
-        <w:t xml:space="preserve">        [[USERNAME_6]]</w:t>
-      </w:r>
-    </w:p>
-    <w:p>
-      <w:r>
-        <w:t xml:space="preserve">        Role: Nurse, Limited access</w:t>
-      </w:r>
-    </w:p>
-    <w:p>
-      <w:r>
-        <w:t xml:space="preserve">     </w:t>
-      </w:r>
-    </w:p>
-    <w:p>
-      <w:r>
-        <w:t xml:space="preserve">     4) Ing. [[PERSON_30]] (IT administrátor)</w:t>
+        <w:t xml:space="preserve">        Email: [[EMAIL_17]]</w:t>
+      </w:r>
+    </w:p>
+    <w:p>
+      <w:r>
+        <w:t xml:space="preserve">        Certifikace: PostgreSQL Certified Professional</w:t>
+      </w:r>
+    </w:p>
+    <w:p>
+      <w:r>
+        <w:t xml:space="preserve">     </w:t>
+      </w:r>
+    </w:p>
+    <w:p>
+      <w:r>
+        <w:t xml:space="preserve">     3) Ing. [[PERSON_33]], Ph.D. (Security Officer)</w:t>
       </w:r>
     </w:p>
     <w:p>
@@ -3164,574 +3711,27 @@
     </w:p>
     <w:p>
       <w:r>
-        <w:t xml:space="preserve">        [[USERNAME_7]]</w:t>
-      </w:r>
-    </w:p>
-    <w:p>
-      <w:r>
-        <w:t xml:space="preserve">        Role: Technical admin</w:t>
-      </w:r>
-    </w:p>
-    <w:p>
-      <w:r>
-        <w:t xml:space="preserve">        Certifikace: RHCE, CCNA, ISO 27001 Lead Implementer</w:t>
-      </w:r>
-    </w:p>
-    <w:p>
-      <w:r>
-        <w:t xml:space="preserve">     </w:t>
-      </w:r>
-    </w:p>
-    <w:p>
-      <w:r>
-        <w:t xml:space="preserve">     5) Bc. [[PERSON_8]] (účetní)</w:t>
+        <w:t xml:space="preserve">        Email: [[EMAIL_18]]</w:t>
+      </w:r>
+    </w:p>
+    <w:p>
+      <w:r>
+        <w:t xml:space="preserve">        Certifikace: CISSP, CISM, CEH</w:t>
+      </w:r>
+    </w:p>
+    <w:p>
+      <w:r>
+        <w:t xml:space="preserve">     </w:t>
+      </w:r>
+    </w:p>
+    <w:p>
+      <w:r>
+        <w:t xml:space="preserve">     4) Mgr. [[PERSON_8]] (GDPR Officer)</w:t>
       </w:r>
     </w:p>
     <w:p>
       <w:r>
         <w:t xml:space="preserve">        [[BIRTH_ID_38]]</w:t>
-      </w:r>
-    </w:p>
-    <w:p>
-      <w:r>
-        <w:t xml:space="preserve">        [[USERNAME_8]]</w:t>
-      </w:r>
-    </w:p>
-    <w:p>
-      <w:r>
-        <w:t xml:space="preserve">        Role: Billing, Read-only patient data</w:t>
-      </w:r>
-    </w:p>
-    <w:p/>
-    <w:p>
-      <w:r>
-        <w:t>───────────────────────────────────────────────────────────────────────────────</w:t>
-      </w:r>
-    </w:p>
-    <w:p/>
-    <w:p>
-      <w:r>
-        <w:t>ČLÁNEK III. - KATEGORIE OSOBNÍCH ÚDAJŮ</w:t>
-      </w:r>
-    </w:p>
-    <w:p/>
-    <w:p>
-      <w:r>
-        <w:t>3.1. ZÁKLADNÍ IDENTIFIKAČNÍ ÚDAJE:</w:t>
-      </w:r>
-    </w:p>
-    <w:p>
-      <w:r>
-        <w:t xml:space="preserve">     - Jméno, příjmení, tituly</w:t>
-      </w:r>
-    </w:p>
-    <w:p>
-      <w:r>
-        <w:t xml:space="preserve">     - Rodné číslo</w:t>
-      </w:r>
-    </w:p>
-    <w:p>
-      <w:r>
-        <w:t xml:space="preserve">     - Datum a místo narození</w:t>
-      </w:r>
-    </w:p>
-    <w:p>
-      <w:r>
-        <w:t xml:space="preserve">     - Adresa trvalého pobytu</w:t>
-      </w:r>
-    </w:p>
-    <w:p>
-      <w:r>
-        <w:t xml:space="preserve">     - Kontaktní údaje (telefon, email)</w:t>
-      </w:r>
-    </w:p>
-    <w:p/>
-    <w:p>
-      <w:r>
-        <w:t>3.2. ZVLÁŠTNÍ KATEGORIE OSOBNÍCH ÚDAJŮ (čl. 9 GDPR):</w:t>
-      </w:r>
-    </w:p>
-    <w:p>
-      <w:r>
-        <w:t xml:space="preserve">     </w:t>
-      </w:r>
-    </w:p>
-    <w:p>
-      <w:r>
-        <w:t xml:space="preserve">     A) ZDRAVOTNÍ ÚDAJE:</w:t>
-      </w:r>
-    </w:p>
-    <w:p>
-      <w:r>
-        <w:t xml:space="preserve">        - Diagnózy (ICD-10 kódy)</w:t>
-      </w:r>
-    </w:p>
-    <w:p>
-      <w:r>
-        <w:t xml:space="preserve">        - Anamnézy (osobní, rodinná)</w:t>
-      </w:r>
-    </w:p>
-    <w:p>
-      <w:r>
-        <w:t xml:space="preserve">        - Medikace (název, dávka, frekvence)</w:t>
-      </w:r>
-    </w:p>
-    <w:p>
-      <w:r>
-        <w:t xml:space="preserve">        - Laboratorní výsledky</w:t>
-      </w:r>
-    </w:p>
-    <w:p>
-      <w:r>
-        <w:t xml:space="preserve">        - Obrazová dokumentace (RTG, CT, MRI, ultrazvuk)</w:t>
-      </w:r>
-    </w:p>
-    <w:p>
-      <w:r>
-        <w:t xml:space="preserve">        - Operační protokoly</w:t>
-      </w:r>
-    </w:p>
-    <w:p>
-      <w:r>
-        <w:t xml:space="preserve">        - Propouštěcí zprávy</w:t>
-      </w:r>
-    </w:p>
-    <w:p>
-      <w:r>
-        <w:t xml:space="preserve">        - Lékařské zprávy</w:t>
-      </w:r>
-    </w:p>
-    <w:p>
-      <w:r>
-        <w:t xml:space="preserve">        - Vakcinační průkaz</w:t>
-      </w:r>
-    </w:p>
-    <w:p>
-      <w:r>
-        <w:t xml:space="preserve">     </w:t>
-      </w:r>
-    </w:p>
-    <w:p>
-      <w:r>
-        <w:t xml:space="preserve">     B) GENETICKÉ ÚDAJE:</w:t>
-      </w:r>
-    </w:p>
-    <w:p>
-      <w:r>
-        <w:t xml:space="preserve">        - Genetické testy (BRCA1/BRCA2, atd.)</w:t>
-      </w:r>
-    </w:p>
-    <w:p>
-      <w:r>
-        <w:t xml:space="preserve">        - Predispozice k nemocem</w:t>
-      </w:r>
-    </w:p>
-    <w:p>
-      <w:r>
-        <w:t xml:space="preserve">        - Farmakogenetické profily</w:t>
-      </w:r>
-    </w:p>
-    <w:p>
-      <w:r>
-        <w:lastRenderedPageBreak/>
-        <w:t xml:space="preserve">     </w:t>
-      </w:r>
-    </w:p>
-    <w:p>
-      <w:r>
-        <w:t xml:space="preserve">     C) BIOMETRICKÉ ÚDAJE:</w:t>
-      </w:r>
-    </w:p>
-    <w:p>
-      <w:r>
-        <w:t xml:space="preserve">        - Fotografie pacienta (pro identifikaci)</w:t>
-      </w:r>
-    </w:p>
-    <w:p>
-      <w:r>
-        <w:t xml:space="preserve">        - Digitalizované podpisy</w:t>
-      </w:r>
-    </w:p>
-    <w:p>
-      <w:r>
-        <w:t xml:space="preserve">        - Otisk prstu (pro přístup k terminálům)</w:t>
-      </w:r>
-    </w:p>
-    <w:p/>
-    <w:p>
-      <w:r>
-        <w:t>3.3. FINANČNÍ ÚDAJE:</w:t>
-      </w:r>
-    </w:p>
-    <w:p>
-      <w:r>
-        <w:t xml:space="preserve">     - Čísla pojištěnců</w:t>
-      </w:r>
-    </w:p>
-    <w:p>
-      <w:r>
-        <w:t xml:space="preserve">     - Fakturační údaje</w:t>
-      </w:r>
-    </w:p>
-    <w:p>
-      <w:r>
-        <w:t xml:space="preserve">     - Bankovní účty pro vrácení doplatků</w:t>
-      </w:r>
-    </w:p>
-    <w:p>
-      <w:r>
-        <w:t xml:space="preserve">     - Doklady o úhradách</w:t>
-      </w:r>
-    </w:p>
-    <w:p/>
-    <w:p>
-      <w:r>
-        <w:t>3.4. KOMUNIKAČNÍ METADATA:</w:t>
-      </w:r>
-    </w:p>
-    <w:p>
-      <w:r>
-        <w:t xml:space="preserve">     - IP adresy přístupů</w:t>
-      </w:r>
-    </w:p>
-    <w:p>
-      <w:r>
-        <w:t xml:space="preserve">     - Logy přihlášení</w:t>
-      </w:r>
-    </w:p>
-    <w:p>
-      <w:r>
-        <w:t xml:space="preserve">     - Historie změn v záznamech</w:t>
-      </w:r>
-    </w:p>
-    <w:p>
-      <w:r>
-        <w:t xml:space="preserve">     - Email komunikace s pacienty</w:t>
-      </w:r>
-    </w:p>
-    <w:p/>
-    <w:p>
-      <w:r>
-        <w:t>───────────────────────────────────────────────────────────────────────────────</w:t>
-      </w:r>
-    </w:p>
-    <w:p/>
-    <w:p>
-      <w:r>
-        <w:t>ČLÁNEK IV. - TECHNICKÉ A ORGANIZAČNÍ OPATŘENÍ</w:t>
-      </w:r>
-    </w:p>
-    <w:p/>
-    <w:p>
-      <w:r>
-        <w:t>4.1. INFRASTRUKTURA:</w:t>
-      </w:r>
-    </w:p>
-    <w:p>
-      <w:r>
-        <w:t xml:space="preserve">     </w:t>
-      </w:r>
-    </w:p>
-    <w:p>
-      <w:r>
-        <w:t xml:space="preserve">     Primární datacenter:</w:t>
-      </w:r>
-    </w:p>
-    <w:p>
-      <w:r>
-        <w:t xml:space="preserve">     Lokace: Datová hala Praha - Holešovice</w:t>
-      </w:r>
-    </w:p>
-    <w:p>
-      <w:r>
-        <w:t xml:space="preserve">     [[ADDRESS_23]]</w:t>
-      </w:r>
-    </w:p>
-    <w:p>
-      <w:r>
-        <w:t xml:space="preserve">     Rack: R-24-A-03</w:t>
-      </w:r>
-    </w:p>
-    <w:p>
-      <w:r>
-        <w:t xml:space="preserve">     Servery:</w:t>
-      </w:r>
-    </w:p>
-    <w:p>
-      <w:r>
-        <w:t xml:space="preserve">     - DB-PROD-01: [[IP_2]] (primary database)</w:t>
-      </w:r>
-    </w:p>
-    <w:p>
-      <w:r>
-        <w:t xml:space="preserve">     - DB-PROD-02: [[IP_3]] (replica)</w:t>
-      </w:r>
-    </w:p>
-    <w:p>
-      <w:r>
-        <w:t xml:space="preserve">     - APP-PROD-01: [[IP_4]] (application server)</w:t>
-      </w:r>
-    </w:p>
-    <w:p>
-      <w:r>
-        <w:t xml:space="preserve">     - APP-PROD-02: [[IP_5]] (load balancer)</w:t>
-      </w:r>
-    </w:p>
-    <w:p>
-      <w:r>
-        <w:t xml:space="preserve">     </w:t>
-      </w:r>
-    </w:p>
-    <w:p>
-      <w:r>
-        <w:t xml:space="preserve">     Backup datacenter:</w:t>
-      </w:r>
-    </w:p>
-    <w:p>
-      <w:r>
-        <w:t xml:space="preserve">     Lokace: DataCloud Brno</w:t>
-      </w:r>
-    </w:p>
-    <w:p>
-      <w:r>
-        <w:t xml:space="preserve">     [[ADDRESS_24]]</w:t>
-      </w:r>
-    </w:p>
-    <w:p>
-      <w:r>
-        <w:t xml:space="preserve">     Rack: R-18-B-07</w:t>
-      </w:r>
-    </w:p>
-    <w:p>
-      <w:r>
-        <w:t xml:space="preserve">     Replikace: real-time (&lt; 5 min RPO)</w:t>
-      </w:r>
-    </w:p>
-    <w:p>
-      <w:r>
-        <w:t xml:space="preserve">     </w:t>
-      </w:r>
-    </w:p>
-    <w:p>
-      <w:r>
-        <w:t xml:space="preserve">     Cloud backup:</w:t>
-      </w:r>
-    </w:p>
-    <w:p>
-      <w:r>
-        <w:t xml:space="preserve">     Provider: AWS Frankfurt (eu-central-1)</w:t>
-      </w:r>
-    </w:p>
-    <w:p>
-      <w:r>
-        <w:t xml:space="preserve">     Šifrování: AES-256</w:t>
-      </w:r>
-    </w:p>
-    <w:p>
-      <w:r>
-        <w:t xml:space="preserve">     Retence: 7 let (dle zákona 372/2011 Sb.)</w:t>
-      </w:r>
-    </w:p>
-    <w:p/>
-    <w:p>
-      <w:r>
-        <w:t>4.2. PŘÍSTUPOVÉ ÚDAJE (SPRÁVCE):</w:t>
-      </w:r>
-    </w:p>
-    <w:p>
-      <w:r>
-        <w:t xml:space="preserve">     </w:t>
-      </w:r>
-    </w:p>
-    <w:p>
-      <w:r>
-        <w:t xml:space="preserve">     Database access:</w:t>
-      </w:r>
-    </w:p>
-    <w:p>
-      <w:r>
-        <w:t xml:space="preserve">     [[HOST_1]]</w:t>
-      </w:r>
-    </w:p>
-    <w:p>
-      <w:r>
-        <w:t xml:space="preserve">     Port: 5432 (PostgreSQL)</w:t>
-      </w:r>
-    </w:p>
-    <w:p>
-      <w:r>
-        <w:t xml:space="preserve">     Database: healthcarepro_production</w:t>
-      </w:r>
-    </w:p>
-    <w:p>
-      <w:r>
-        <w:t xml:space="preserve">     [[USERNAME_9]]</w:t>
-      </w:r>
-    </w:p>
-    <w:p>
-      <w:r>
-        <w:t xml:space="preserve">     [[PASSWORD_2]]</w:t>
-      </w:r>
-    </w:p>
-    <w:p>
-      <w:r>
-        <w:t xml:space="preserve">     SSL: required (cert: hcp-2024.pem)</w:t>
-      </w:r>
-    </w:p>
-    <w:p>
-      <w:r>
-        <w:t xml:space="preserve">     </w:t>
-      </w:r>
-    </w:p>
-    <w:p>
-      <w:r>
-        <w:t xml:space="preserve">     Application admin panel:</w:t>
-      </w:r>
-    </w:p>
-    <w:p>
-      <w:r>
-        <w:t xml:space="preserve">     URL: https://admin.healthcarepro.cloudmed.cz</w:t>
-      </w:r>
-    </w:p>
-    <w:p>
-      <w:r>
-        <w:t xml:space="preserve">     [[USERNAME_10]]</w:t>
-      </w:r>
-    </w:p>
-    <w:p>
-      <w:r>
-        <w:t xml:space="preserve">     [[PASSWORD_3]]</w:t>
-      </w:r>
-    </w:p>
-    <w:p>
-      <w:r>
-        <w:t xml:space="preserve">     2FA: TOTP (Google Authenticator)</w:t>
-      </w:r>
-    </w:p>
-    <w:p>
-      <w:r>
-        <w:t xml:space="preserve">     </w:t>
-      </w:r>
-    </w:p>
-    <w:p>
-      <w:r>
-        <w:t xml:space="preserve">     SFTP backup access:</w:t>
-      </w:r>
-    </w:p>
-    <w:p>
-      <w:r>
-        <w:t xml:space="preserve">     [[HOST_2]]</w:t>
-      </w:r>
-    </w:p>
-    <w:p>
-      <w:r>
-        <w:t xml:space="preserve">     Port: 22</w:t>
-      </w:r>
-    </w:p>
-    <w:p>
-      <w:r>
-        <w:t xml:space="preserve">     [[USERNAME_11]]</w:t>
-      </w:r>
-    </w:p>
-    <w:p>
-      <w:r>
-        <w:t xml:space="preserve">     SSH Key: hcp-backup-2024.key (4096-bit RSA)</w:t>
-      </w:r>
-    </w:p>
-    <w:p/>
-    <w:p>
-      <w:r>
-        <w:t>4.3. OPRÁVNĚNÉ OSOBY ZPRACOVATELE:</w:t>
-      </w:r>
-    </w:p>
-    <w:p>
-      <w:r>
-        <w:t xml:space="preserve">     </w:t>
-      </w:r>
-    </w:p>
-    <w:p>
-      <w:r>
-        <w:t xml:space="preserve">     1) Ing. [[PERSON_31]] (Cloud Architect)</w:t>
-      </w:r>
-    </w:p>
-    <w:p>
-      <w:r>
-        <w:t xml:space="preserve">        [[BIRTH_ID_39]]</w:t>
-      </w:r>
-    </w:p>
-    <w:p>
-      <w:r>
-        <w:t xml:space="preserve">        Email: [[EMAIL_16]]</w:t>
-      </w:r>
-    </w:p>
-    <w:p>
-      <w:r>
-        <w:t xml:space="preserve">        Certifikace: AWS Solutions Architect Professional</w:t>
-      </w:r>
-    </w:p>
-    <w:p>
-      <w:r>
-        <w:t xml:space="preserve">     </w:t>
-      </w:r>
-    </w:p>
-    <w:p>
-      <w:r>
-        <w:t xml:space="preserve">     2) Bc. [[PERSON_32]] (DBA)</w:t>
-      </w:r>
-    </w:p>
-    <w:p>
-      <w:r>
-        <w:t xml:space="preserve">        [[BIRTH_ID_40]]</w:t>
-      </w:r>
-    </w:p>
-    <w:p>
-      <w:r>
-        <w:t xml:space="preserve">        Email: [[EMAIL_17]]</w:t>
-      </w:r>
-    </w:p>
-    <w:p>
-      <w:r>
-        <w:t xml:space="preserve">        Certifikace: PostgreSQL Certified Professional</w:t>
-      </w:r>
-    </w:p>
-    <w:p>
-      <w:r>
-        <w:t xml:space="preserve">     </w:t>
-      </w:r>
-    </w:p>
-    <w:p>
-      <w:r>
-        <w:t xml:space="preserve">     3) Ing. [[PERSON_33]], Ph.D. (Security Officer)</w:t>
-      </w:r>
-    </w:p>
-    <w:p>
-      <w:r>
-        <w:t xml:space="preserve">        [[BIRTH_ID_41]]</w:t>
-      </w:r>
-    </w:p>
-    <w:p>
-      <w:r>
-        <w:t xml:space="preserve">        Email: [[EMAIL_18]]</w:t>
-      </w:r>
-    </w:p>
-    <w:p>
-      <w:r>
-        <w:t xml:space="preserve">        Certifikace: CISSP, CISM, CEH</w:t>
-      </w:r>
-    </w:p>
-    <w:p>
-      <w:r>
-        <w:t xml:space="preserve">     </w:t>
-      </w:r>
-    </w:p>
-    <w:p>
-      <w:r>
-        <w:t xml:space="preserve">     4) Mgr. [[PERSON_8]] (GDPR Officer)</w:t>
-      </w:r>
-    </w:p>
-    <w:p>
-      <w:r>
-        <w:t xml:space="preserve">        [[BIRTH_ID_42]]</w:t>
       </w:r>
     </w:p>
     <w:p>
@@ -3861,7 +3861,7 @@
     </w:p>
     <w:p>
       <w:r>
-        <w:t xml:space="preserve">        Osoba odpovědná: Ing. [[PERSON_34]], [[BIRTH_ID_43]]</w:t>
+        <w:t xml:space="preserve">        Osoba odpovědná: Ing. [[PERSON_34]], [[BIRTH_ID_39]]</w:t>
       </w:r>
     </w:p>
     <w:p>
@@ -3896,7 +3896,7 @@
     </w:p>
     <w:p>
       <w:r>
-        <w:t xml:space="preserve">        Osoba odpovědná: Bc. [[PERSON_35]], [[BIRTH_ID_44]]</w:t>
+        <w:t xml:space="preserve">        Osoba odpovědná: Bc. [[PERSON_35]], [[BIRTH_ID_40]]</w:t>
       </w:r>
     </w:p>
     <w:p>
@@ -3982,7 +3982,7 @@
     </w:p>
     <w:p>
       <w:r>
-        <w:t>6.5. První faktura: [[ADDRESS_28]][[PHONE_24]]</w:t>
+        <w:t>6.5. První faktura: [[ADDRESS_28]][[PHONE_25]]</w:t>
       </w:r>
     </w:p>
     <w:p/>
@@ -4086,7 +4086,7 @@
     </w:p>
     <w:p>
       <w:r>
-        <w:t xml:space="preserve">     - SMS[[PHONE_25]]</w:t>
+        <w:t xml:space="preserve">     - SMS[[PHONE_26]]</w:t>
       </w:r>
     </w:p>
     <w:p>
@@ -4181,7 +4181,7 @@
     </w:p>
     <w:p>
       <w:r>
-        <w:t>[[BIRTH_ID_20]]                            [[BIRTH_ID_21]]</w:t>
+        <w:t>[[BIRTH_ID_19]]                            [[BIRTH_ID_20]]</w:t>
       </w:r>
     </w:p>
     <w:p/>
@@ -4256,7 +4256,7 @@
     </w:p>
     <w:p>
       <w:r>
-        <w:t>[[PHONE_26]]</w:t>
+        <w:t>[[PHONE_27]]</w:t>
       </w:r>
     </w:p>
     <w:p>
@@ -4282,7 +4282,7 @@
     </w:p>
     <w:p>
       <w:r>
-        <w:t>[[BIRTH_ID_45]]</w:t>
+        <w:t>[[BIRTH_ID_41]]</w:t>
       </w:r>
     </w:p>
     <w:p>
@@ -4312,7 +4312,7 @@
     </w:p>
     <w:p>
       <w:r>
-        <w:t>[[PHONE_27]]</w:t>
+        <w:t>[[PHONE_28]]</w:t>
       </w:r>
     </w:p>
     <w:p>
@@ -4343,7 +4343,7 @@
     </w:p>
     <w:p>
       <w:r>
-        <w:t>[[DATE_50]], [[BIRTH_ID_46]]</w:t>
+        <w:t>[[DATE_50]], [[BIRTH_ID_42]]</w:t>
       </w:r>
     </w:p>
     <w:p>
@@ -4374,7 +4374,7 @@
     </w:p>
     <w:p>
       <w:r>
-        <w:t>[[BIRTH_ID_47]]</w:t>
+        <w:t>[[BIRTH_ID_43]]</w:t>
       </w:r>
     </w:p>
     <w:p>
@@ -4384,7 +4384,7 @@
     </w:p>
     <w:p>
       <w:r>
-        <w:t>[[PHONE_28]]</w:t>
+        <w:t>[[PHONE_29]]</w:t>
       </w:r>
     </w:p>
     <w:p>
@@ -4420,7 +4420,7 @@
     </w:p>
     <w:p>
       <w:r>
-        <w:t>[[BIRTH_ID_48]]</w:t>
+        <w:t>[[BIRTH_ID_44]]</w:t>
       </w:r>
     </w:p>
     <w:p>
@@ -4430,7 +4430,7 @@
     </w:p>
     <w:p>
       <w:r>
-        <w:t>[[PHONE_29]]</w:t>
+        <w:t>[[PHONE_30]]</w:t>
       </w:r>
     </w:p>
     <w:p>
@@ -4571,7 +4571,7 @@
     </w:p>
     <w:p>
       <w:r>
-        <w:t xml:space="preserve">     Kontakt: [[EMAIL_24]], [[PHONE_30]]</w:t>
+        <w:t xml:space="preserve">     Kontakt: [[EMAIL_24]], [[PHONE_31]]</w:t>
       </w:r>
     </w:p>
     <w:p/>
@@ -5280,7 +5280,7 @@
     </w:p>
     <w:p>
       <w:r>
-        <w:t xml:space="preserve">     Ručitel 1: Ing. [[PERSON_38]], [[BIRTH_ID_47]]</w:t>
+        <w:t xml:space="preserve">     Ručitel 1: Ing. [[PERSON_38]], [[BIRTH_ID_43]]</w:t>
       </w:r>
     </w:p>
     <w:p>
@@ -5300,7 +5300,7 @@
     </w:p>
     <w:p>
       <w:r>
-        <w:t xml:space="preserve">     Ručitel 2: Mgr. [[PERSON_39]], [[BIRTH_ID_48]]</w:t>
+        <w:t xml:space="preserve">     Ručitel 2: Mgr. [[PERSON_39]], [[BIRTH_ID_44]]</w:t>
       </w:r>
     </w:p>
     <w:p>
@@ -5380,7 +5380,7 @@
     </w:p>
     <w:p>
       <w:r>
-        <w:t xml:space="preserve">     Majitel: Mgr. [[PERSON_36]], [[BIRTH_ID_45]]</w:t>
+        <w:t xml:space="preserve">     Majitel: Mgr. [[PERSON_36]], [[BIRTH_ID_41]]</w:t>
       </w:r>
     </w:p>
     <w:p/>
@@ -5481,7 +5481,7 @@
     </w:p>
     <w:p>
       <w:r>
-        <w:t xml:space="preserve">     [[PHONE_31]]</w:t>
+        <w:t xml:space="preserve">     [[PHONE_32]]</w:t>
       </w:r>
     </w:p>
     <w:p/>
@@ -5510,7 +5510,7 @@
     </w:p>
     <w:p>
       <w:r>
-        <w:t xml:space="preserve">   [[BIRTH_ID_49]]</w:t>
+        <w:t xml:space="preserve">   [[BIRTH_ID_45]]</w:t>
       </w:r>
     </w:p>
     <w:p>
@@ -5526,7 +5526,7 @@
     </w:p>
     <w:p>
       <w:r>
-        <w:t xml:space="preserve">   [[BIRTH_ID_50]]</w:t>
+        <w:t xml:space="preserve">   [[BIRTH_ID_46]]</w:t>
       </w:r>
     </w:p>
     <w:p>
@@ -5542,7 +5542,7 @@
     </w:p>
     <w:p>
       <w:r>
-        <w:t xml:space="preserve">   [[BIRTH_ID_51]]</w:t>
+        <w:t xml:space="preserve">   [[BIRTH_ID_47]]</w:t>
       </w:r>
     </w:p>
     <w:p>
@@ -5558,7 +5558,7 @@
     </w:p>
     <w:p>
       <w:r>
-        <w:t xml:space="preserve">   [[BIRTH_ID_52]]</w:t>
+        <w:t xml:space="preserve">   [[BIRTH_ID_48]]</w:t>
       </w:r>
     </w:p>
     <w:p>
@@ -5607,7 +5607,7 @@
     </w:p>
     <w:p>
       <w:r>
-        <w:t>[[BIRTH_ID_49]]</w:t>
+        <w:t>[[BIRTH_ID_45]]</w:t>
       </w:r>
     </w:p>
     <w:p/>
@@ -5628,7 +5628,7 @@
     </w:p>
     <w:p>
       <w:r>
-        <w:t>[[BIRTH_ID_45]]                            [[BIRTH_ID_46]]</w:t>
+        <w:t>[[BIRTH_ID_41]]                            [[BIRTH_ID_42]]</w:t>
       </w:r>
     </w:p>
     <w:p/>
@@ -5649,7 +5649,7 @@
     </w:p>
     <w:p>
       <w:r>
-        <w:t>[[BIRTH_ID_47]]                            [[BIRTH_ID_48]]</w:t>
+        <w:t>[[BIRTH_ID_43]]                            [[BIRTH_ID_44]]</w:t>
       </w:r>
     </w:p>
     <w:p/>
@@ -5734,7 +5734,7 @@
     </w:p>
     <w:p>
       <w:r>
-        <w:t>[[BIRTH_ID_53]]</w:t>
+        <w:t>[[BIRTH_ID_49]]</w:t>
       </w:r>
     </w:p>
     <w:p>
@@ -5744,7 +5744,7 @@
     </w:p>
     <w:p>
       <w:r>
-        <w:t>[[PHONE_32]]</w:t>
+        <w:t>[[PHONE_33]]</w:t>
       </w:r>
     </w:p>
     <w:p/>
@@ -5785,7 +5785,7 @@
     </w:p>
     <w:p>
       <w:r>
-        <w:t>[[BIRTH_ID_54]]</w:t>
+        <w:t>[[BIRTH_ID_50]]</w:t>
       </w:r>
     </w:p>
     <w:p>
@@ -6008,7 +6008,7 @@
     </w:p>
     <w:p>
       <w:r>
-        <w:t xml:space="preserve">     [[BIRTH_ID_55]]</w:t>
+        <w:t xml:space="preserve">     [[BIRTH_ID_51]]</w:t>
       </w:r>
     </w:p>
     <w:p>
@@ -6018,7 +6018,7 @@
     </w:p>
     <w:p>
       <w:r>
-        <w:t xml:space="preserve">     [[PHONE_33]]</w:t>
+        <w:t xml:space="preserve">     [[PHONE_34]]</w:t>
       </w:r>
     </w:p>
     <w:p>
@@ -6124,7 +6124,7 @@
     </w:p>
     <w:p>
       <w:r>
-        <w:t xml:space="preserve">     [[BIRTH_ID_56]]</w:t>
+        <w:t xml:space="preserve">     [[BIRTH_ID_52]]</w:t>
       </w:r>
     </w:p>
     <w:p>
@@ -6134,7 +6134,7 @@
     </w:p>
     <w:p>
       <w:r>
-        <w:t xml:space="preserve">     [[PHONE_34]]</w:t>
+        <w:t xml:space="preserve">     [[PHONE_35]]</w:t>
       </w:r>
     </w:p>
     <w:p>
@@ -6230,7 +6230,7 @@
     </w:p>
     <w:p>
       <w:r>
-        <w:t xml:space="preserve">     [[BIRTH_ID_57]]</w:t>
+        <w:t xml:space="preserve">     [[BIRTH_ID_53]]</w:t>
       </w:r>
     </w:p>
     <w:p>
@@ -6240,7 +6240,7 @@
     </w:p>
     <w:p>
       <w:r>
-        <w:t xml:space="preserve">     [[PHONE_35]]</w:t>
+        <w:t xml:space="preserve">     [[PHONE_36]]</w:t>
       </w:r>
     </w:p>
     <w:p>
@@ -6408,7 +6408,7 @@
     </w:p>
     <w:p>
       <w:r>
-        <w:t xml:space="preserve">        [[BIRTH_ID_53]]</w:t>
+        <w:t xml:space="preserve">        [[BIRTH_ID_49]]</w:t>
       </w:r>
     </w:p>
     <w:p>
@@ -6423,7 +6423,7 @@
     </w:p>
     <w:p>
       <w:r>
-        <w:t xml:space="preserve">        [[PHONE_32]]</w:t>
+        <w:t xml:space="preserve">        [[PHONE_33]]</w:t>
       </w:r>
     </w:p>
     <w:p>
@@ -6443,7 +6443,7 @@
     </w:p>
     <w:p>
       <w:r>
-        <w:t xml:space="preserve">        [[BIRTH_ID_58]]</w:t>
+        <w:t xml:space="preserve">        [[BIRTH_ID_54]]</w:t>
       </w:r>
     </w:p>
     <w:p>
@@ -6458,7 +6458,7 @@
     </w:p>
     <w:p>
       <w:r>
-        <w:t xml:space="preserve">        [[PHONE_20]]</w:t>
+        <w:t xml:space="preserve">        [[PHONE_21]]</w:t>
       </w:r>
     </w:p>
     <w:p>
@@ -6498,7 +6498,7 @@
     </w:p>
     <w:p>
       <w:r>
-        <w:t xml:space="preserve">        [[BIRTH_ID_43]]</w:t>
+        <w:t xml:space="preserve">        [[BIRTH_ID_39]]</w:t>
       </w:r>
     </w:p>
     <w:p>
@@ -6554,7 +6554,7 @@
     </w:p>
     <w:p>
       <w:r>
-        <w:t xml:space="preserve">        [[BIRTH_ID_59]]</w:t>
+        <w:t xml:space="preserve">        [[BIRTH_ID_55]]</w:t>
       </w:r>
     </w:p>
     <w:p>
@@ -6569,7 +6569,7 @@
     </w:p>
     <w:p>
       <w:r>
-        <w:t xml:space="preserve">        [[PHONE_2]]</w:t>
+        <w:t xml:space="preserve">        [[PHONE_3]]</w:t>
       </w:r>
     </w:p>
     <w:p>
@@ -6594,7 +6594,7 @@
     </w:p>
     <w:p>
       <w:r>
-        <w:t xml:space="preserve">        [[BIRTH_ID_15]]</w:t>
+        <w:t xml:space="preserve">        [[BIRTH_ID_14]]</w:t>
       </w:r>
     </w:p>
     <w:p>
@@ -6665,7 +6665,7 @@
     </w:p>
     <w:p>
       <w:r>
-        <w:t xml:space="preserve">       [[PHONE_36]]</w:t>
+        <w:t xml:space="preserve">       [[PHONE_37]]</w:t>
       </w:r>
     </w:p>
     <w:p>
@@ -7164,7 +7164,7 @@
     </w:p>
     <w:p>
       <w:r>
-        <w:t xml:space="preserve">        [[BIRTH_ID_54]]</w:t>
+        <w:t xml:space="preserve">        [[BIRTH_ID_50]]</w:t>
       </w:r>
     </w:p>
     <w:p>
@@ -7189,7 +7189,7 @@
     </w:p>
     <w:p>
       <w:r>
-        <w:t xml:space="preserve">        [[BIRTH_ID_60]]</w:t>
+        <w:t xml:space="preserve">        [[BIRTH_ID_56]]</w:t>
       </w:r>
     </w:p>
     <w:p>
@@ -7214,7 +7214,7 @@
     </w:p>
     <w:p>
       <w:r>
-        <w:t xml:space="preserve">        [[BIRTH_ID_61]]</w:t>
+        <w:t xml:space="preserve">        [[BIRTH_ID_57]]</w:t>
       </w:r>
     </w:p>
     <w:p>
@@ -7462,7 +7462,7 @@
     </w:p>
     <w:p>
       <w:r>
-        <w:t>[[BIRTH_ID_53]]                           [[BIRTH_ID_54]]</w:t>
+        <w:t>[[BIRTH_ID_49]]                           [[BIRTH_ID_50]]</w:t>
       </w:r>
     </w:p>
     <w:p/>

</xml_diff>